<commit_message>
restructure: use products as main index
</commit_message>
<xml_diff>
--- a/プロンプト06242026.docx
+++ b/プロンプト06242026.docx
@@ -4,20 +4,113 @@
   <w:body>
     <w:p>
       <w:r>
-        <w:t>①ピンクの空間を修正　直ってる</w:t>
+        <w:t>①</w:t>
+      </w:r>
+      <w:r>
+        <w:t>OUR COLOR PALETTEが表示</w:t>
+      </w:r>
+      <w:r>
+        <w:rPr>
+          <w:rFonts w:hint="eastAsia"/>
+        </w:rPr>
+        <w:t>できてる</w:t>
+      </w:r>
+    </w:p>
+    <w:p>
+      <w:r>
+        <w:rPr>
+          <w:rFonts w:hint="eastAsia"/>
+        </w:rPr>
+        <w:t>②Earrings、Bookmarks、Rings　の文字を大きくする</w:t>
       </w:r>
     </w:p>
     <w:p>
       <w:pPr>
+        <w:widowControl/>
+        <w:shd w:val="clear" w:color="auto" w:fill="121314"/>
+        <w:spacing w:line="285" w:lineRule="atLeast"/>
+        <w:rPr>
+          <w:rFonts w:ascii="Consolas" w:eastAsia="ＭＳ Ｐゴシック" w:hAnsi="Consolas" w:cs="ＭＳ Ｐゴシック"/>
+          <w:color w:val="BBBEBF"/>
+          <w:kern w:val="0"/>
+          <w:szCs w:val="21"/>
+          <w14:ligatures w14:val="none"/>
+        </w:rPr>
+      </w:pPr>
+      <w:r>
+        <w:t>.product-nav-tab {</w:t>
+      </w:r>
+      <w:r>
         <w:rPr>
           <w:rFonts w:hint="eastAsia"/>
         </w:rPr>
+        <w:t xml:space="preserve">　、</w:t>
+      </w:r>
+      <w:r>
+        <w:rPr>
+          <w:rFonts w:ascii="Consolas" w:eastAsia="ＭＳ Ｐゴシック" w:hAnsi="Consolas" w:cs="ＭＳ Ｐゴシック"/>
+          <w:color w:val="9CDCFE"/>
+          <w:kern w:val="0"/>
+          <w:szCs w:val="21"/>
+          <w14:ligatures w14:val="none"/>
+        </w:rPr>
+        <w:t>font-size</w:t>
+      </w:r>
+      <w:r>
+        <w:rPr>
+          <w:rFonts w:ascii="Consolas" w:eastAsia="ＭＳ Ｐゴシック" w:hAnsi="Consolas" w:cs="ＭＳ Ｐゴシック"/>
+          <w:color w:val="D4D4D4"/>
+          <w:kern w:val="0"/>
+          <w:szCs w:val="21"/>
+          <w14:ligatures w14:val="none"/>
+        </w:rPr>
+        <w:t xml:space="preserve">: </w:t>
+      </w:r>
+      <w:r>
+        <w:rPr>
+          <w:rFonts w:ascii="Consolas" w:eastAsia="ＭＳ Ｐゴシック" w:hAnsi="Consolas" w:cs="ＭＳ Ｐゴシック"/>
+          <w:color w:val="B5CEA8"/>
+          <w:kern w:val="0"/>
+          <w:szCs w:val="21"/>
+          <w14:ligatures w14:val="none"/>
+        </w:rPr>
+        <w:t>1.2rem</w:t>
+      </w:r>
+      <w:r>
+        <w:rPr>
+          <w:rFonts w:ascii="Consolas" w:eastAsia="ＭＳ Ｐゴシック" w:hAnsi="Consolas" w:cs="ＭＳ Ｐゴシック"/>
+          <w:color w:val="D4D4D4"/>
+          <w:kern w:val="0"/>
+          <w:szCs w:val="21"/>
+          <w14:ligatures w14:val="none"/>
+        </w:rPr>
+        <w:t>;</w:t>
+      </w:r>
+    </w:p>
+    <w:p>
+      <w:r>
+        <w:rPr>
+          <w:rFonts w:hint="eastAsia"/>
+        </w:rPr>
+        <w:t>を変更する。</w:t>
+      </w:r>
+    </w:p>
+    <w:p>
+      <w:pPr>
+        <w:rPr>
+          <w:rFonts w:hint="eastAsia"/>
+        </w:rPr>
       </w:pPr>
       <w:r>
         <w:rPr>
           <w:rFonts w:hint="eastAsia"/>
         </w:rPr>
-        <w:t>②Earrings、Bookmarks、Rings　の文字を大きくする</w:t>
+        <w:t xml:space="preserve"> </w:t>
+      </w:r>
+    </w:p>
+    <w:p>
+      <w:r>
+        <w:t>github.ioで見てるんだけど</w:t>
       </w:r>
       <w:r>
         <w:br/>
@@ -26,155 +119,76 @@
         <w:rPr>
           <w:rFonts w:hint="eastAsia"/>
         </w:rPr>
-        <w:t>③Earringsカテゴリーの中に、</w:t>
-      </w:r>
-      <w:r>
-        <w:t>カラーカテゴリーボタンを</w:t>
+        <w:t>①Earrings　Bookmarks　RINGSの商品カードの文字が大きすぎて見切れてる。</w:t>
+      </w:r>
+      <w:r>
+        <w:br/>
       </w:r>
       <w:r>
         <w:rPr>
           <w:rFonts w:hint="eastAsia"/>
         </w:rPr>
-        <w:t>作って</w:t>
-      </w:r>
-      <w:r>
-        <w:t>２列で表示させる</w:t>
-      </w:r>
+        <w:t>②Earringsの中のカラーカテゴリーボタンのサイズがバラバラ</w:t>
+      </w:r>
+    </w:p>
+    <w:p>
       <w:r>
         <w:rPr>
           <w:rFonts w:hint="eastAsia"/>
         </w:rPr>
-        <w:t>。形は商品カードの中にあるDetails on eBayと同じ形の文字のみの</w:t>
-      </w:r>
-      <w:r>
-        <w:br/>
-      </w:r>
+        <w:t>③EarringsもBookmarksも商品カード内の写真が横スクロールできなくなってて2枚目が表示されない</w:t>
+      </w:r>
+    </w:p>
+    <w:p>
       <w:r>
         <w:rPr>
           <w:rFonts w:hint="eastAsia"/>
         </w:rPr>
-        <w:t>④Earringsの中だけ、カラーカテゴリー別に商品カードを表示させ、カラーカテゴリーボタンからそれぞれのカラーのトップに飛べるようにする</w:t>
-      </w:r>
-      <w:r>
-        <w:br/>
-      </w:r>
+        <w:t>④画面が固定されず、スクロールしようとすると横に揺れる</w:t>
+      </w:r>
+    </w:p>
+    <w:p>
       <w:r>
         <w:rPr>
           <w:rFonts w:hint="eastAsia"/>
         </w:rPr>
-        <w:t>④Earringsの各カラーカテゴリーのトップから商品カテゴリーのトップに飛べるようにする</w:t>
-      </w:r>
-      <w:r>
-        <w:br/>
+        <w:t>⑤</w:t>
+      </w:r>
+      <w:r>
+        <w:t>Earrings　Bookmarks　RINGSの商品カードの</w:t>
       </w:r>
       <w:r>
         <w:rPr>
           <w:rFonts w:hint="eastAsia"/>
         </w:rPr>
-        <w:t xml:space="preserve">⑤About </w:t>
+        <w:t>Bookmarksだけスクロールしない。</w:t>
+      </w:r>
+    </w:p>
+    <w:p>
+      <w:pPr>
+        <w:rPr>
+          <w:rFonts w:hint="eastAsia"/>
+        </w:rPr>
+      </w:pPr>
+      <w:r>
+        <w:rPr>
+          <w:rFonts w:hint="eastAsia"/>
+        </w:rPr>
+        <w:t>⑥</w:t>
       </w:r>
       <w:proofErr w:type="spellStart"/>
       <w:r>
         <w:rPr>
           <w:rFonts w:hint="eastAsia"/>
         </w:rPr>
-        <w:t>totoi</w:t>
+        <w:t>yoko</w:t>
       </w:r>
       <w:proofErr w:type="spellEnd"/>
       <w:r>
         <w:rPr>
           <w:rFonts w:hint="eastAsia"/>
         </w:rPr>
-        <w:t xml:space="preserve"> </w:t>
-      </w:r>
-      <w:proofErr w:type="spellStart"/>
-      <w:r>
-        <w:rPr>
-          <w:rFonts w:hint="eastAsia"/>
-        </w:rPr>
-        <w:t>japan</w:t>
-      </w:r>
-      <w:proofErr w:type="spellEnd"/>
-      <w:r>
-        <w:rPr>
-          <w:rFonts w:hint="eastAsia"/>
-        </w:rPr>
-        <w:t>の直下に横長の写真を追加する</w:t>
-      </w:r>
-      <w:r>
-        <w:br/>
-      </w:r>
-      <w:r>
-        <w:rPr>
-          <w:rFonts w:hint="eastAsia"/>
-        </w:rPr>
-        <w:t>⑥</w:t>
-      </w:r>
-      <w:r>
-        <w:rPr>
-          <w:rFonts w:hint="eastAsia"/>
-        </w:rPr>
-        <w:t xml:space="preserve">About </w:t>
-      </w:r>
-      <w:proofErr w:type="spellStart"/>
-      <w:r>
-        <w:rPr>
-          <w:rFonts w:hint="eastAsia"/>
-        </w:rPr>
-        <w:t>totoi</w:t>
-      </w:r>
-      <w:proofErr w:type="spellEnd"/>
-      <w:r>
-        <w:rPr>
-          <w:rFonts w:hint="eastAsia"/>
-        </w:rPr>
-        <w:t xml:space="preserve"> </w:t>
-      </w:r>
-      <w:proofErr w:type="spellStart"/>
-      <w:r>
-        <w:rPr>
-          <w:rFonts w:hint="eastAsia"/>
-        </w:rPr>
-        <w:t>japan</w:t>
-      </w:r>
-      <w:proofErr w:type="spellEnd"/>
-      <w:r>
-        <w:rPr>
-          <w:rFonts w:hint="eastAsia"/>
-        </w:rPr>
-        <w:t>の</w:t>
-      </w:r>
-      <w:r>
-        <w:rPr>
-          <w:rFonts w:hint="eastAsia"/>
-        </w:rPr>
-        <w:t>本文の</w:t>
-      </w:r>
-      <w:r>
-        <w:rPr>
-          <w:rFonts w:hint="eastAsia"/>
-        </w:rPr>
-        <w:t>直下に</w:t>
-      </w:r>
-      <w:r>
-        <w:rPr>
-          <w:rFonts w:hint="eastAsia"/>
-        </w:rPr>
-        <w:t>２枚の小さな写真を間を開けてセンタリングで表示、左の写真の下に</w:t>
-      </w:r>
-      <w:proofErr w:type="spellStart"/>
-      <w:r>
-        <w:rPr>
-          <w:rFonts w:hint="eastAsia"/>
-        </w:rPr>
-        <w:t>yoko</w:t>
-      </w:r>
-      <w:proofErr w:type="spellEnd"/>
-      <w:r>
-        <w:rPr>
-          <w:rFonts w:hint="eastAsia"/>
-        </w:rPr>
-        <w:t xml:space="preserve"> 右の写真の下に mami と入れる。</w:t>
+        <w:t xml:space="preserve"> と　mami の写真が離れすぎててサイズが変わってしまってる</w:t>
       </w:r>
     </w:p>
     <w:sectPr>
@@ -185,6 +199,44 @@
     </w:sectPr>
   </w:body>
 </w:document>
+</file>
+
+<file path=word/endnotes.xml><?xml version="1.0" encoding="utf-8"?>
+<w:endnotes xmlns:wpc="http://schemas.microsoft.com/office/word/2010/wordprocessingCanvas" xmlns:cx="http://schemas.microsoft.com/office/drawing/2014/chartex" xmlns:cx1="http://schemas.microsoft.com/office/drawing/2015/9/8/chartex" xmlns:cx2="http://schemas.microsoft.com/office/drawing/2015/10/21/chartex" xmlns:cx3="http://schemas.microsoft.com/office/drawing/2016/5/9/chartex" xmlns:cx4="http://schemas.microsoft.com/office/drawing/2016/5/10/chartex" xmlns:cx5="http://schemas.microsoft.com/office/drawing/2016/5/11/chartex" xmlns:cx6="http://schemas.microsoft.com/office/drawing/2016/5/12/chartex" xmlns:cx7="http://schemas.microsoft.com/office/drawing/2016/5/13/chartex" xmlns:cx8="http://schemas.microsoft.com/office/drawing/2016/5/14/chartex" xmlns:mc="http://schemas.openxmlformats.org/markup-compatibility/2006" xmlns:aink="http://schemas.microsoft.com/office/drawing/2016/ink" xmlns:am3d="http://schemas.microsoft.com/office/drawing/2017/model3d" xmlns:o="urn:schemas-microsoft-com:office:office" xmlns:oel="http://schemas.microsoft.com/office/2019/extlst" xmlns:r="http://schemas.openxmlformats.org/officeDocument/2006/relationships" xmlns:m="http://schemas.openxmlformats.org/officeDocument/2006/math" xmlns:v="urn:schemas-microsoft-com:vml" xmlns:wp14="http://schemas.microsoft.com/office/word/2010/wordprocessingDrawing" xmlns:wp="http://schemas.openxmlformats.org/drawingml/2006/wordprocessingDrawing" xmlns:w10="urn:schemas-microsoft-com:office:word" xmlns:w="http://schemas.openxmlformats.org/wordprocessingml/2006/main" xmlns:w14="http://schemas.microsoft.com/office/word/2010/wordml" xmlns:w15="http://schemas.microsoft.com/office/word/2012/wordml" xmlns:w16cex="http://schemas.microsoft.com/office/word/2018/wordml/cex" xmlns:w16cid="http://schemas.microsoft.com/office/word/2016/wordml/cid" xmlns:w16="http://schemas.microsoft.com/office/word/2018/wordml" xmlns:w16du="http://schemas.microsoft.com/office/word/2023/wordml/word16du" xmlns:w16sdtdh="http://schemas.microsoft.com/office/word/2020/wordml/sdtdatahash" xmlns:w16sdtfl="http://schemas.microsoft.com/office/word/2024/wordml/sdtformatlock" xmlns:w16se="http://schemas.microsoft.com/office/word/2015/wordml/symex" xmlns:wpg="http://schemas.microsoft.com/office/word/2010/wordprocessingGroup" xmlns:wpi="http://schemas.microsoft.com/office/word/2010/wordprocessingInk" xmlns:wne="http://schemas.microsoft.com/office/word/2006/wordml" xmlns:wps="http://schemas.microsoft.com/office/word/2010/wordprocessingShape" mc:Ignorable="w14 w15 w16se w16cid w16 w16cex w16sdtdh w16sdtfl w16du wp14">
+  <w:endnote w:type="separator" w:id="-1">
+    <w:p>
+      <w:r>
+        <w:separator/>
+      </w:r>
+    </w:p>
+  </w:endnote>
+  <w:endnote w:type="continuationSeparator" w:id="0">
+    <w:p>
+      <w:r>
+        <w:continuationSeparator/>
+      </w:r>
+    </w:p>
+  </w:endnote>
+</w:endnotes>
+</file>
+
+<file path=word/footnotes.xml><?xml version="1.0" encoding="utf-8"?>
+<w:footnotes xmlns:wpc="http://schemas.microsoft.com/office/word/2010/wordprocessingCanvas" xmlns:cx="http://schemas.microsoft.com/office/drawing/2014/chartex" xmlns:cx1="http://schemas.microsoft.com/office/drawing/2015/9/8/chartex" xmlns:cx2="http://schemas.microsoft.com/office/drawing/2015/10/21/chartex" xmlns:cx3="http://schemas.microsoft.com/office/drawing/2016/5/9/chartex" xmlns:cx4="http://schemas.microsoft.com/office/drawing/2016/5/10/chartex" xmlns:cx5="http://schemas.microsoft.com/office/drawing/2016/5/11/chartex" xmlns:cx6="http://schemas.microsoft.com/office/drawing/2016/5/12/chartex" xmlns:cx7="http://schemas.microsoft.com/office/drawing/2016/5/13/chartex" xmlns:cx8="http://schemas.microsoft.com/office/drawing/2016/5/14/chartex" xmlns:mc="http://schemas.openxmlformats.org/markup-compatibility/2006" xmlns:aink="http://schemas.microsoft.com/office/drawing/2016/ink" xmlns:am3d="http://schemas.microsoft.com/office/drawing/2017/model3d" xmlns:o="urn:schemas-microsoft-com:office:office" xmlns:oel="http://schemas.microsoft.com/office/2019/extlst" xmlns:r="http://schemas.openxmlformats.org/officeDocument/2006/relationships" xmlns:m="http://schemas.openxmlformats.org/officeDocument/2006/math" xmlns:v="urn:schemas-microsoft-com:vml" xmlns:wp14="http://schemas.microsoft.com/office/word/2010/wordprocessingDrawing" xmlns:wp="http://schemas.openxmlformats.org/drawingml/2006/wordprocessingDrawing" xmlns:w10="urn:schemas-microsoft-com:office:word" xmlns:w="http://schemas.openxmlformats.org/wordprocessingml/2006/main" xmlns:w14="http://schemas.microsoft.com/office/word/2010/wordml" xmlns:w15="http://schemas.microsoft.com/office/word/2012/wordml" xmlns:w16cex="http://schemas.microsoft.com/office/word/2018/wordml/cex" xmlns:w16cid="http://schemas.microsoft.com/office/word/2016/wordml/cid" xmlns:w16="http://schemas.microsoft.com/office/word/2018/wordml" xmlns:w16du="http://schemas.microsoft.com/office/word/2023/wordml/word16du" xmlns:w16sdtdh="http://schemas.microsoft.com/office/word/2020/wordml/sdtdatahash" xmlns:w16sdtfl="http://schemas.microsoft.com/office/word/2024/wordml/sdtformatlock" xmlns:w16se="http://schemas.microsoft.com/office/word/2015/wordml/symex" xmlns:wpg="http://schemas.microsoft.com/office/word/2010/wordprocessingGroup" xmlns:wpi="http://schemas.microsoft.com/office/word/2010/wordprocessingInk" xmlns:wne="http://schemas.microsoft.com/office/word/2006/wordml" xmlns:wps="http://schemas.microsoft.com/office/word/2010/wordprocessingShape" mc:Ignorable="w14 w15 w16se w16cid w16 w16cex w16sdtdh w16sdtfl w16du wp14">
+  <w:footnote w:type="separator" w:id="-1">
+    <w:p>
+      <w:r>
+        <w:separator/>
+      </w:r>
+    </w:p>
+  </w:footnote>
+  <w:footnote w:type="continuationSeparator" w:id="0">
+    <w:p>
+      <w:r>
+        <w:continuationSeparator/>
+      </w:r>
+    </w:p>
+  </w:footnote>
+</w:footnotes>
 </file>
 
 <file path=word/styles.xml><?xml version="1.0" encoding="utf-8"?>
@@ -1097,6 +1149,62 @@
       <w:spacing w:val="5"/>
     </w:rPr>
   </w:style>
+  <w:style w:type="paragraph" w:styleId="aa">
+    <w:name w:val="header"/>
+    <w:basedOn w:val="a"/>
+    <w:link w:val="ab"/>
+    <w:uiPriority w:val="99"/>
+    <w:unhideWhenUsed/>
+    <w:rsid w:val="00C84449"/>
+    <w:pPr>
+      <w:tabs>
+        <w:tab w:val="center" w:pos="4252"/>
+        <w:tab w:val="right" w:pos="8504"/>
+      </w:tabs>
+      <w:snapToGrid w:val="0"/>
+    </w:pPr>
+  </w:style>
+  <w:style w:type="character" w:customStyle="1" w:styleId="ab">
+    <w:name w:val="ヘッダー (文字)"/>
+    <w:basedOn w:val="a0"/>
+    <w:link w:val="aa"/>
+    <w:uiPriority w:val="99"/>
+    <w:rsid w:val="00C84449"/>
+  </w:style>
+  <w:style w:type="paragraph" w:styleId="ac">
+    <w:name w:val="footer"/>
+    <w:basedOn w:val="a"/>
+    <w:link w:val="ad"/>
+    <w:uiPriority w:val="99"/>
+    <w:unhideWhenUsed/>
+    <w:rsid w:val="00C84449"/>
+    <w:pPr>
+      <w:tabs>
+        <w:tab w:val="center" w:pos="4252"/>
+        <w:tab w:val="right" w:pos="8504"/>
+      </w:tabs>
+      <w:snapToGrid w:val="0"/>
+    </w:pPr>
+  </w:style>
+  <w:style w:type="character" w:customStyle="1" w:styleId="ad">
+    <w:name w:val="フッター (文字)"/>
+    <w:basedOn w:val="a0"/>
+    <w:link w:val="ac"/>
+    <w:uiPriority w:val="99"/>
+    <w:rsid w:val="00C84449"/>
+  </w:style>
+  <w:style w:type="character" w:styleId="ae">
+    <w:name w:val="Hyperlink"/>
+    <w:basedOn w:val="a0"/>
+    <w:uiPriority w:val="99"/>
+    <w:semiHidden/>
+    <w:unhideWhenUsed/>
+    <w:rsid w:val="00A87380"/>
+    <w:rPr>
+      <w:color w:val="0000FF"/>
+      <w:u w:val="single"/>
+    </w:rPr>
+  </w:style>
 </w:styles>
 </file>
 

</xml_diff>

<commit_message>
Replace eBay links with Etsy, fix email, remove unused files
</commit_message>
<xml_diff>
--- a/プロンプト06242026.docx
+++ b/プロンプト06242026.docx
@@ -96,6 +96,48 @@
       </w:r>
     </w:p>
     <w:p>
+      <w:r>
+        <w:rPr>
+          <w:rFonts w:hint="eastAsia"/>
+        </w:rPr>
+        <w:t xml:space="preserve"> </w:t>
+      </w:r>
+    </w:p>
+    <w:p>
+      <w:r>
+        <w:br/>
+      </w:r>
+      <w:r>
+        <w:br/>
+      </w:r>
+      <w:r>
+        <w:rPr>
+          <w:rFonts w:hint="eastAsia"/>
+        </w:rPr>
+        <w:t>スマホでもブラウザでも</w:t>
+      </w:r>
+      <w:r>
+        <w:rPr>
+          <w:rFonts w:hint="eastAsia"/>
+        </w:rPr>
+        <w:t>Netlifyが</w:t>
+      </w:r>
+      <w:proofErr w:type="spellStart"/>
+      <w:r>
+        <w:rPr>
+          <w:rFonts w:hint="eastAsia"/>
+        </w:rPr>
+        <w:t>index,html</w:t>
+      </w:r>
+      <w:proofErr w:type="spellEnd"/>
+      <w:r>
+        <w:rPr>
+          <w:rFonts w:hint="eastAsia"/>
+        </w:rPr>
+        <w:t>を読み込んでproducts.htmlを読み込んでくれない</w:t>
+      </w:r>
+    </w:p>
+    <w:p>
       <w:pPr>
         <w:rPr>
           <w:rFonts w:hint="eastAsia"/>
@@ -105,12 +147,45 @@
         <w:rPr>
           <w:rFonts w:hint="eastAsia"/>
         </w:rPr>
-        <w:t xml:space="preserve"> </w:t>
-      </w:r>
-    </w:p>
-    <w:p>
-      <w:r>
-        <w:t>github.ioで見てるんだけど</w:t>
+        <w:t>GitHubで確認したら</w:t>
+      </w:r>
+      <w:r>
+        <w:rPr>
+          <w:rFonts w:hint="eastAsia"/>
+        </w:rPr>
+        <w:t>スマホの表示に問題がある</w:t>
+      </w:r>
+    </w:p>
+    <w:p>
+      <w:r>
+        <w:rPr>
+          <w:rFonts w:hint="eastAsia"/>
+        </w:rPr>
+        <w:t>②</w:t>
+      </w:r>
+      <w:r>
+        <w:rPr>
+          <w:rFonts w:hint="eastAsia"/>
+        </w:rPr>
+        <w:t>Earrings　Bookmarks</w:t>
+      </w:r>
+      <w:r>
+        <w:rPr>
+          <w:rFonts w:hint="eastAsia"/>
+        </w:rPr>
+        <w:t xml:space="preserve"> Rings</w:t>
+      </w:r>
+      <w:r>
+        <w:rPr>
+          <w:rFonts w:hint="eastAsia"/>
+        </w:rPr>
+        <w:t>の商品カードの文字が大きすぎて</w:t>
+      </w:r>
+      <w:r>
+        <w:rPr>
+          <w:rFonts w:hint="eastAsia"/>
+        </w:rPr>
+        <w:t>横スクロールする形になってる。</w:t>
       </w:r>
       <w:r>
         <w:br/>
@@ -119,7 +194,155 @@
         <w:rPr>
           <w:rFonts w:hint="eastAsia"/>
         </w:rPr>
-        <w:t>①Earrings　Bookmarks　RINGSの商品カードの文字が大きすぎて見切れてる。</w:t>
+        <w:t>③</w:t>
+      </w:r>
+      <w:r>
+        <w:rPr>
+          <w:rFonts w:hint="eastAsia"/>
+        </w:rPr>
+        <w:t>Earringsの中のカラーカテゴリーボタン</w:t>
+      </w:r>
+      <w:r>
+        <w:rPr>
+          <w:rFonts w:hint="eastAsia"/>
+        </w:rPr>
+        <w:t>の位置がずれて、前は菱形に集まってたのに、ただの見栄えの悪い縦２列になってる。</w:t>
+      </w:r>
+    </w:p>
+    <w:p>
+      <w:r>
+        <w:rPr>
+          <w:rFonts w:hint="eastAsia"/>
+        </w:rPr>
+        <w:t>③EarringsもBookmarksも商品カード内の写真が横スクロールできなくなってて2枚目が表示されない</w:t>
+      </w:r>
+    </w:p>
+    <w:p>
+      <w:r>
+        <w:rPr>
+          <w:rFonts w:hint="eastAsia"/>
+        </w:rPr>
+        <w:t>⑤</w:t>
+      </w:r>
+      <w:r>
+        <w:rPr>
+          <w:rFonts w:hint="eastAsia"/>
+        </w:rPr>
+        <w:t xml:space="preserve">しおり- Bookmarks </w:t>
+      </w:r>
+      <w:proofErr w:type="spellStart"/>
+      <w:r>
+        <w:rPr>
+          <w:rFonts w:hint="eastAsia"/>
+        </w:rPr>
+        <w:t>Bookmarks</w:t>
+      </w:r>
+      <w:proofErr w:type="spellEnd"/>
+      <w:r>
+        <w:rPr>
+          <w:rFonts w:hint="eastAsia"/>
+        </w:rPr>
+        <w:t xml:space="preserve"> の右横の文字　←All Colors は間違い。</w:t>
+      </w:r>
+      <w:r>
+        <w:rPr>
+          <w:rFonts w:hint="eastAsia"/>
+        </w:rPr>
+        <w:t>スクロールすべき場所は</w:t>
+      </w:r>
+      <w:r>
+        <w:rPr>
+          <w:rFonts w:hint="eastAsia"/>
+        </w:rPr>
+        <w:t>Earrings　Bookmarks Ringsの商品カード</w:t>
+      </w:r>
+      <w:r>
+        <w:rPr>
+          <w:rFonts w:hint="eastAsia"/>
+        </w:rPr>
+        <w:t xml:space="preserve">のところ。　ボタンは　</w:t>
+      </w:r>
+      <w:r>
+        <w:rPr>
+          <w:rFonts w:hint="eastAsia"/>
+        </w:rPr>
+        <w:t xml:space="preserve">指輪 </w:t>
+      </w:r>
+      <w:r>
+        <w:t>–</w:t>
+      </w:r>
+      <w:r>
+        <w:rPr>
+          <w:rFonts w:hint="eastAsia"/>
+        </w:rPr>
+        <w:t xml:space="preserve"> Rings　</w:t>
+      </w:r>
+      <w:proofErr w:type="spellStart"/>
+      <w:r>
+        <w:rPr>
+          <w:rFonts w:hint="eastAsia"/>
+        </w:rPr>
+        <w:t>Rings</w:t>
+      </w:r>
+      <w:proofErr w:type="spellEnd"/>
+      <w:r>
+        <w:rPr>
+          <w:rFonts w:hint="eastAsia"/>
+        </w:rPr>
+        <w:t xml:space="preserve">　の右横の　↑Back to top と同じが正解</w:t>
+      </w:r>
+    </w:p>
+    <w:p>
+      <w:r>
+        <w:rPr>
+          <w:rFonts w:hint="eastAsia"/>
+        </w:rPr>
+        <w:t>⑧giftwrapped の写真が大きすぎて横並びになってない。</w:t>
+      </w:r>
+    </w:p>
+    <w:p/>
+    <w:p/>
+    <w:p>
+      <w:r>
+        <w:rPr>
+          <w:rFonts w:hint="eastAsia"/>
+        </w:rPr>
+        <w:t xml:space="preserve">①ピアス </w:t>
+      </w:r>
+      <w:r>
+        <w:t>–</w:t>
+      </w:r>
+      <w:r>
+        <w:rPr>
+          <w:rFonts w:hint="eastAsia"/>
+        </w:rPr>
+        <w:t xml:space="preserve"> EARRINGS　</w:t>
+      </w:r>
+      <w:proofErr w:type="spellStart"/>
+      <w:r>
+        <w:rPr>
+          <w:rFonts w:hint="eastAsia"/>
+        </w:rPr>
+        <w:t>Earrings</w:t>
+      </w:r>
+      <w:proofErr w:type="spellEnd"/>
+      <w:r>
+        <w:rPr>
+          <w:rFonts w:hint="eastAsia"/>
+        </w:rPr>
+        <w:t xml:space="preserve"> の右横に</w:t>
+      </w:r>
+      <w:r>
+        <w:rPr>
+          <w:rFonts w:hint="eastAsia"/>
+        </w:rPr>
+        <w:t>↑Back to top</w:t>
+      </w:r>
+      <w:r>
+        <w:rPr>
+          <w:rFonts w:hint="eastAsia"/>
+        </w:rPr>
+        <w:t xml:space="preserve">　を追加して</w:t>
       </w:r>
       <w:r>
         <w:br/>
@@ -128,42 +351,42 @@
         <w:rPr>
           <w:rFonts w:hint="eastAsia"/>
         </w:rPr>
-        <w:t>②Earringsの中のカラーカテゴリーボタンのサイズがバラバラ</w:t>
-      </w:r>
-    </w:p>
-    <w:p>
-      <w:r>
-        <w:rPr>
-          <w:rFonts w:hint="eastAsia"/>
-        </w:rPr>
-        <w:t>③EarringsもBookmarksも商品カード内の写真が横スクロールできなくなってて2枚目が表示されない</w:t>
-      </w:r>
-    </w:p>
-    <w:p>
-      <w:r>
-        <w:rPr>
-          <w:rFonts w:hint="eastAsia"/>
-        </w:rPr>
-        <w:t>④画面が固定されず、スクロールしようとすると横に揺れる</w:t>
-      </w:r>
-    </w:p>
-    <w:p>
-      <w:r>
-        <w:rPr>
-          <w:rFonts w:hint="eastAsia"/>
-        </w:rPr>
-        <w:t>⑤</w:t>
-      </w:r>
-      <w:r>
-        <w:t>Earrings　Bookmarks　RINGSの商品カードの</w:t>
-      </w:r>
-      <w:r>
-        <w:rPr>
-          <w:rFonts w:hint="eastAsia"/>
-        </w:rPr>
-        <w:t>Bookmarksだけスクロールしない。</w:t>
-      </w:r>
-    </w:p>
+        <w:t>②</w:t>
+      </w:r>
+      <w:r>
+        <w:rPr>
+          <w:rFonts w:hint="eastAsia"/>
+        </w:rPr>
+        <w:t xml:space="preserve">↑Back to top　</w:t>
+      </w:r>
+      <w:r>
+        <w:rPr>
+          <w:rFonts w:hint="eastAsia"/>
+        </w:rPr>
+        <w:t xml:space="preserve">からのスクロール先はSHOP BY CATEGORY と </w:t>
+      </w:r>
+      <w:r>
+        <w:rPr>
+          <w:rFonts w:hint="eastAsia"/>
+        </w:rPr>
+        <w:t>Earrings　Bookmarks Ringsの商品カード</w:t>
+      </w:r>
+      <w:r>
+        <w:rPr>
+          <w:rFonts w:hint="eastAsia"/>
+        </w:rPr>
+        <w:t xml:space="preserve">　が見える位置へ統一</w:t>
+      </w:r>
+    </w:p>
+    <w:p>
+      <w:r>
+        <w:rPr>
+          <w:rFonts w:hint="eastAsia"/>
+        </w:rPr>
+        <w:t>③Earringsの中のカラーカテゴリーボタン８つをひし形に見えるように配置して</w:t>
+      </w:r>
+    </w:p>
+    <w:p/>
     <w:p>
       <w:pPr>
         <w:rPr>
@@ -174,21 +397,44 @@
         <w:rPr>
           <w:rFonts w:hint="eastAsia"/>
         </w:rPr>
-        <w:t>⑥</w:t>
-      </w:r>
-      <w:proofErr w:type="spellStart"/>
-      <w:r>
-        <w:rPr>
-          <w:rFonts w:hint="eastAsia"/>
-        </w:rPr>
-        <w:t>yoko</w:t>
-      </w:r>
-      <w:proofErr w:type="spellEnd"/>
-      <w:r>
-        <w:rPr>
-          <w:rFonts w:hint="eastAsia"/>
-        </w:rPr>
-        <w:t xml:space="preserve"> と　mami の写真が離れすぎててサイズが変わってしまってる</w:t>
+        <w:t>④</w:t>
+      </w:r>
+      <w:r>
+        <w:rPr>
+          <w:rFonts w:hint="eastAsia"/>
+        </w:rPr>
+        <w:t>Shop the collection ボタン</w:t>
+      </w:r>
+      <w:r>
+        <w:rPr>
+          <w:rFonts w:hint="eastAsia"/>
+        </w:rPr>
+        <w:t>をFooterにあるShipping &amp; Returns のすぐ上にも追加。</w:t>
+      </w:r>
+    </w:p>
+    <w:p>
+      <w:pPr>
+        <w:rPr>
+          <w:rFonts w:hint="eastAsia"/>
+        </w:rPr>
+      </w:pPr>
+      <w:r>
+        <w:rPr>
+          <w:rFonts w:hint="eastAsia"/>
+        </w:rPr>
+        <w:t>④Shop the collection ボタンからのスクロール先は</w:t>
+      </w:r>
+      <w:r>
+        <w:rPr>
+          <w:rFonts w:hint="eastAsia"/>
+        </w:rPr>
+        <w:t>SHOP BY CATEGORY と Earrings　Bookmarks Ringsの商品カード　が見える位置</w:t>
+      </w:r>
+      <w:r>
+        <w:rPr>
+          <w:rFonts w:hint="eastAsia"/>
+        </w:rPr>
+        <w:t>へ統一</w:t>
       </w:r>
     </w:p>
     <w:sectPr>

</xml_diff>